<commit_message>
docs/comments: platform-neutral wording; drop machine- and site-specific references
Audit of every tracked file for first-person or site-specific text. Reworded:
"this Apple-Silicon Mac", "tested on this machine", "lab Linux HPC", "Docker Desktop",
an external-drive example path, and the cluster-specific group/partition values in the
deployment guide (now <group>/<partition> placeholders). Platform guidance for macOS /
Apple Silicon users (x86_64 images run under emulation; CONDA_SUBDIR=osx-64) is kept,
stated neutrally. Dorado is described as a native host binary (arm64 or x86_64).
Manual DOCX/PDF and the architecture figure regenerated from source. No functional change.

Co-Authored-By: Claude Fable 5.1 <noreply@anthropic.com>
Claude-Session: https://claude.ai/code/session_015u9XA3XRsUotdfMt5Ujm8q
</commit_message>
<xml_diff>
--- a/docs/manual/fungiforge_manual.docx
+++ b/docs/manual/fungiforge_manual.docx
@@ -82,7 +82,7 @@
         <w:p>
           <w:r>
             <w:fldChar w:fldCharType="begin" w:dirty="true"/>
-            <w:instrText xml:space="preserve">TOC \o "1-3" \h \z \u</w:instrText>
+            <w:instrText xml:space="preserve">TOC \o "1-2" \h \z \u</w:instrText>
             <w:fldChar w:fldCharType="separate"/>
             <w:fldChar w:fldCharType="end"/>
           </w:r>
@@ -100,6 +100,15 @@
         <w:pStyle w:val="Heading1"/>
       </w:pPr>
       <w:r>
+        <w:rPr>
+          <w:rStyle w:val="SectionNumber"/>
+        </w:rPr>
+        <w:t xml:space="preserve">1</w:t>
+      </w:r>
+      <w:r>
+        <w:tab/>
+      </w:r>
+      <w:r>
         <w:t xml:space="preserve">1. Introduction</w:t>
       </w:r>
     </w:p>
@@ -756,6 +765,15 @@
       <w:pPr>
         <w:pStyle w:val="Heading1"/>
       </w:pPr>
+      <w:r>
+        <w:rPr>
+          <w:rStyle w:val="SectionNumber"/>
+        </w:rPr>
+        <w:t xml:space="preserve">2</w:t>
+      </w:r>
+      <w:r>
+        <w:tab/>
+      </w:r>
       <w:r>
         <w:t xml:space="preserve">2. Concepts</w:t>
       </w:r>
@@ -2094,6 +2112,15 @@
         <w:pStyle w:val="Heading1"/>
       </w:pPr>
       <w:r>
+        <w:rPr>
+          <w:rStyle w:val="SectionNumber"/>
+        </w:rPr>
+        <w:t xml:space="preserve">3</w:t>
+      </w:r>
+      <w:r>
+        <w:tab/>
+      </w:r>
+      <w:r>
         <w:t xml:space="preserve">3. Pipeline architecture</w:t>
       </w:r>
     </w:p>
@@ -2238,7 +2265,7 @@
       <w:r>
         <w:drawing>
           <wp:inline>
-            <wp:extent cx="5334000" cy="4008463"/>
+            <wp:extent cx="5334000" cy="4009123"/>
             <wp:effectExtent b="0" l="0" r="0" t="0"/>
             <wp:docPr descr="FungiForge Layer-1 pipeline DAG — the 15 stages colour-coded by group; the optional Dorado basecall and the four skippable feature-calling stages are dashed; external reference databases (amber) feed the ID/resistance/BGC/novelty stages; the antifungal-resistance stage (red, ★) is the bespoke centerpiece; everything converges on Stage 14, which emits master_fungi.tsv — the handoff to the Layer-2 One Health analysis." title="" id="12" name="Picture"/>
             <a:graphic>
@@ -2259,7 +2286,7 @@
                   <pic:spPr bwMode="auto">
                     <a:xfrm>
                       <a:off x="0" y="0"/>
-                      <a:ext cx="5334000" cy="4008463"/>
+                      <a:ext cx="5334000" cy="4009123"/>
                     </a:xfrm>
                     <a:prstGeom prst="rect">
                       <a:avLst/>
@@ -2422,7 +2449,7 @@
               <w:jc w:val="left"/>
             </w:pPr>
             <w:r>
-              <w:t xml:space="preserve">Dorado (native arm64 host / base image)</w:t>
+              <w:t xml:space="preserve">Dorado (native host binary / base image)</w:t>
             </w:r>
           </w:p>
         </w:tc>
@@ -4154,6 +4181,15 @@
         <w:pStyle w:val="Heading1"/>
       </w:pPr>
       <w:r>
+        <w:rPr>
+          <w:rStyle w:val="SectionNumber"/>
+        </w:rPr>
+        <w:t xml:space="preserve">4</w:t>
+      </w:r>
+      <w:r>
+        <w:tab/>
+      </w:r>
+      <w:r>
         <w:t xml:space="preserve">4. Installation</w:t>
       </w:r>
     </w:p>
@@ -4246,6 +4282,15 @@
         <w:pStyle w:val="Heading2"/>
       </w:pPr>
       <w:r>
+        <w:rPr>
+          <w:rStyle w:val="SectionNumber"/>
+        </w:rPr>
+        <w:t xml:space="preserve">4.1</w:t>
+      </w:r>
+      <w:r>
+        <w:tab/>
+      </w:r>
+      <w:r>
         <w:t xml:space="preserve">4.1 Local install (workstation / laptop)</w:t>
       </w:r>
     </w:p>
@@ -4466,7 +4511,7 @@
         <w:t xml:space="preserve"> </w:t>
       </w:r>
       <w:r>
-        <w:t xml:space="preserve">On an M-series Mac the</w:t>
+        <w:t xml:space="preserve">On Apple Silicon the</w:t>
       </w:r>
       <w:r>
         <w:t xml:space="preserve"> </w:t>
@@ -4546,7 +4591,7 @@
         <w:t xml:space="preserve"> </w:t>
       </w:r>
       <w:r>
-        <w:t xml:space="preserve">on the Mac</w:t>
+        <w:t xml:space="preserve">for local runs</w:t>
       </w:r>
       <w:r>
         <w:t xml:space="preserve"> </w:t>
@@ -4632,7 +4677,7 @@
         <w:t xml:space="preserve"> </w:t>
       </w:r>
       <w:r>
-        <w:t xml:space="preserve">stays fast on the Mac. The light conda envs that have no</w:t>
+        <w:t xml:space="preserve">stays fast on Apple Silicon. The light conda envs that have no</w:t>
       </w:r>
       <w:r>
         <w:t xml:space="preserve"> </w:t>
@@ -4761,6 +4806,15 @@
         <w:pStyle w:val="Heading2"/>
       </w:pPr>
       <w:r>
+        <w:rPr>
+          <w:rStyle w:val="SectionNumber"/>
+        </w:rPr>
+        <w:t xml:space="preserve">4.2</w:t>
+      </w:r>
+      <w:r>
+        <w:tab/>
+      </w:r>
+      <w:r>
         <w:t xml:space="preserve">4.2 Shared HPC install (SLURM + Apptainer/Singularity)</w:t>
       </w:r>
     </w:p>
@@ -5360,6 +5414,15 @@
       <w:pPr>
         <w:pStyle w:val="Heading2"/>
       </w:pPr>
+      <w:r>
+        <w:rPr>
+          <w:rStyle w:val="SectionNumber"/>
+        </w:rPr>
+        <w:t xml:space="preserve">4.3</w:t>
+      </w:r>
+      <w:r>
+        <w:tab/>
+      </w:r>
       <w:r>
         <w:t xml:space="preserve">4.3 How FungiForge uses containers and conda envs</w:t>
       </w:r>
@@ -5711,6 +5774,15 @@
         <w:pStyle w:val="Heading1"/>
       </w:pPr>
       <w:r>
+        <w:rPr>
+          <w:rStyle w:val="SectionNumber"/>
+        </w:rPr>
+        <w:t xml:space="preserve">5</w:t>
+      </w:r>
+      <w:r>
+        <w:tab/>
+      </w:r>
+      <w:r>
         <w:t xml:space="preserve">5. The</w:t>
       </w:r>
       <w:r>
@@ -5734,6 +5806,15 @@
       <w:pPr>
         <w:pStyle w:val="Heading2"/>
       </w:pPr>
+      <w:r>
+        <w:rPr>
+          <w:rStyle w:val="SectionNumber"/>
+        </w:rPr>
+        <w:t xml:space="preserve">5.1</w:t>
+      </w:r>
+      <w:r>
+        <w:tab/>
+      </w:r>
       <w:r>
         <w:t xml:space="preserve">5.1 The console command</w:t>
       </w:r>
@@ -5982,6 +6063,15 @@
         <w:pStyle w:val="Heading2"/>
       </w:pPr>
       <w:r>
+        <w:rPr>
+          <w:rStyle w:val="SectionNumber"/>
+        </w:rPr>
+        <w:t xml:space="preserve">5.2</w:t>
+      </w:r>
+      <w:r>
+        <w:tab/>
+      </w:r>
+      <w:r>
         <w:t xml:space="preserve">5.2 The</w:t>
       </w:r>
       <w:r>
@@ -6045,7 +6135,7 @@
         <w:rPr>
           <w:rStyle w:val="CommentTok"/>
         </w:rPr>
-        <w:t xml:space="preserve"># this machine, Docker (Apple-Silicon: linux/amd64 emulated)</w:t>
+        <w:t xml:space="preserve"># single machine, Docker (on arm64 hosts: linux/amd64 emulated)</w:t>
       </w:r>
       <w:r>
         <w:br/>
@@ -6123,7 +6213,7 @@
         <w:rPr>
           <w:rStyle w:val="CommentTok"/>
         </w:rPr>
-        <w:t xml:space="preserve"># lab Linux HPC, native (no emulation)</w:t>
+        <w:t xml:space="preserve"># SLURM cluster, native (no emulation)</w:t>
       </w:r>
       <w:r>
         <w:br/>
@@ -6569,6 +6659,15 @@
         <w:pStyle w:val="Heading2"/>
       </w:pPr>
       <w:r>
+        <w:rPr>
+          <w:rStyle w:val="SectionNumber"/>
+        </w:rPr>
+        <w:t xml:space="preserve">5.3</w:t>
+      </w:r>
+      <w:r>
+        <w:tab/>
+      </w:r>
+      <w:r>
         <w:t xml:space="preserve">5.3 Quickstart (test fixture)</w:t>
       </w:r>
     </w:p>
@@ -6692,6 +6791,15 @@
         <w:pStyle w:val="Heading1"/>
       </w:pPr>
       <w:r>
+        <w:rPr>
+          <w:rStyle w:val="SectionNumber"/>
+        </w:rPr>
+        <w:t xml:space="preserve">6</w:t>
+      </w:r>
+      <w:r>
+        <w:tab/>
+      </w:r>
+      <w:r>
         <w:t xml:space="preserve">6. Reference databases</w:t>
       </w:r>
     </w:p>
@@ -6885,6 +6993,15 @@
       <w:pPr>
         <w:pStyle w:val="Heading2"/>
       </w:pPr>
+      <w:r>
+        <w:rPr>
+          <w:rStyle w:val="SectionNumber"/>
+        </w:rPr>
+        <w:t xml:space="preserve">6.1</w:t>
+      </w:r>
+      <w:r>
+        <w:tab/>
+      </w:r>
       <w:r>
         <w:t xml:space="preserve">6.1 The databases</w:t>
       </w:r>
@@ -7659,6 +7776,15 @@
         <w:pStyle w:val="Heading2"/>
       </w:pPr>
       <w:r>
+        <w:rPr>
+          <w:rStyle w:val="SectionNumber"/>
+        </w:rPr>
+        <w:t xml:space="preserve">6.2</w:t>
+      </w:r>
+      <w:r>
+        <w:tab/>
+      </w:r>
+      <w:r>
         <w:t xml:space="preserve">6.2 Staging them</w:t>
       </w:r>
     </w:p>
@@ -7929,6 +8055,15 @@
         <w:pStyle w:val="Heading1"/>
       </w:pPr>
       <w:r>
+        <w:rPr>
+          <w:rStyle w:val="SectionNumber"/>
+        </w:rPr>
+        <w:t xml:space="preserve">7</w:t>
+      </w:r>
+      <w:r>
+        <w:tab/>
+      </w:r>
+      <w:r>
         <w:t xml:space="preserve">7. Inputs — the sample sheet</w:t>
       </w:r>
     </w:p>
@@ -8944,6 +9079,15 @@
       <w:pPr>
         <w:pStyle w:val="Heading1"/>
       </w:pPr>
+      <w:r>
+        <w:rPr>
+          <w:rStyle w:val="SectionNumber"/>
+        </w:rPr>
+        <w:t xml:space="preserve">8</w:t>
+      </w:r>
+      <w:r>
+        <w:tab/>
+      </w:r>
       <w:r>
         <w:t xml:space="preserve">8. Configuration &amp; parameters</w:t>
       </w:r>
@@ -9837,7 +9981,7 @@
               <w:pStyle w:val="Compact"/>
             </w:pPr>
             <w:r>
-              <w:t xml:space="preserve">Stage 07 InterProScan (heavy; default off on Mac, on for HPC)</w:t>
+              <w:t xml:space="preserve">Stage 07 InterProScan (heavy; default off, enable on a cluster)</w:t>
             </w:r>
           </w:p>
         </w:tc>
@@ -10221,7 +10365,7 @@
               <w:pStyle w:val="Compact"/>
             </w:pPr>
             <w:r>
-              <w:t xml:space="preserve">max cores per task on this machine</w:t>
+              <w:t xml:space="preserve">max cores per task on the local machine</w:t>
             </w:r>
           </w:p>
         </w:tc>
@@ -10585,6 +10729,15 @@
         <w:pStyle w:val="Heading1"/>
       </w:pPr>
       <w:r>
+        <w:rPr>
+          <w:rStyle w:val="SectionNumber"/>
+        </w:rPr>
+        <w:t xml:space="preserve">9</w:t>
+      </w:r>
+      <w:r>
+        <w:tab/>
+      </w:r>
+      <w:r>
         <w:t xml:space="preserve">9. The stages in detail</w:t>
       </w:r>
     </w:p>
@@ -10641,6 +10794,15 @@
         <w:pStyle w:val="Heading2"/>
       </w:pPr>
       <w:r>
+        <w:rPr>
+          <w:rStyle w:val="SectionNumber"/>
+        </w:rPr>
+        <w:t xml:space="preserve">9.1</w:t>
+      </w:r>
+      <w:r>
+        <w:tab/>
+      </w:r>
+      <w:r>
         <w:t xml:space="preserve">9.1 Stage 00 — Basecall (optional)</w:t>
       </w:r>
     </w:p>
@@ -10716,37 +10878,34 @@
         <w:t xml:space="preserve"> </w:t>
       </w:r>
       <w:r>
-        <w:t xml:space="preserve">errors). Dorado runs as the</w:t>
-      </w:r>
-      <w:r>
-        <w:t xml:space="preserve"> </w:t>
-      </w:r>
-      <w:r>
-        <w:rPr>
-          <w:b/>
-          <w:bCs/>
-        </w:rPr>
-        <w:t xml:space="preserve">native arm64</w:t>
-      </w:r>
-      <w:r>
-        <w:rPr>
-          <w:b/>
-          <w:bCs/>
-        </w:rPr>
-        <w:t xml:space="preserve"> </w:t>
-      </w:r>
-      <w:r>
-        <w:rPr>
-          <w:b/>
-          <w:bCs/>
-        </w:rPr>
-        <w:t xml:space="preserve">host binary</w:t>
-      </w:r>
-      <w:r>
-        <w:t xml:space="preserve"> </w:t>
-      </w:r>
-      <w:r>
-        <w:t xml:space="preserve">for speed on Apple Silicon. Supports duplex via</w:t>
+        <w:t xml:space="preserve">errors). Dorado runs as a</w:t>
+      </w:r>
+      <w:r>
+        <w:t xml:space="preserve"> </w:t>
+      </w:r>
+      <w:r>
+        <w:rPr>
+          <w:b/>
+          <w:bCs/>
+        </w:rPr>
+        <w:t xml:space="preserve">native host</w:t>
+      </w:r>
+      <w:r>
+        <w:rPr>
+          <w:b/>
+          <w:bCs/>
+        </w:rPr>
+        <w:t xml:space="preserve"> </w:t>
+      </w:r>
+      <w:r>
+        <w:rPr>
+          <w:b/>
+          <w:bCs/>
+        </w:rPr>
+        <w:t xml:space="preserve">binary</w:t>
+      </w:r>
+      <w:r>
+        <w:t xml:space="preserve">, which keeps basecalling fast on Apple Silicon. Supports duplex via</w:t>
       </w:r>
       <w:r>
         <w:t xml:space="preserve"> </w:t>
@@ -10860,6 +11019,15 @@
         <w:pStyle w:val="Heading2"/>
       </w:pPr>
       <w:r>
+        <w:rPr>
+          <w:rStyle w:val="SectionNumber"/>
+        </w:rPr>
+        <w:t xml:space="preserve">9.2</w:t>
+      </w:r>
+      <w:r>
+        <w:tab/>
+      </w:r>
+      <w:r>
         <w:t xml:space="preserve">9.2 Stage 01 — Read QC &amp; filter (mode-aware)</w:t>
       </w:r>
     </w:p>
@@ -11064,6 +11232,15 @@
         <w:pStyle w:val="Heading2"/>
       </w:pPr>
       <w:r>
+        <w:rPr>
+          <w:rStyle w:val="SectionNumber"/>
+        </w:rPr>
+        <w:t xml:space="preserve">9.3</w:t>
+      </w:r>
+      <w:r>
+        <w:tab/>
+      </w:r>
+      <w:r>
         <w:t xml:space="preserve">9.3 Stage 02 — Assembly (long-read) / Stage 02b — Assembly (short-read)</w:t>
       </w:r>
     </w:p>
@@ -11322,6 +11499,15 @@
         <w:pStyle w:val="Heading2"/>
       </w:pPr>
       <w:r>
+        <w:rPr>
+          <w:rStyle w:val="SectionNumber"/>
+        </w:rPr>
+        <w:t xml:space="preserve">9.4</w:t>
+      </w:r>
+      <w:r>
+        <w:tab/>
+      </w:r>
+      <w:r>
         <w:t xml:space="preserve">9.4 Stage 03a — ONT polish (Medaka), long-read isolates</w:t>
       </w:r>
     </w:p>
@@ -11400,6 +11586,15 @@
       <w:pPr>
         <w:pStyle w:val="Heading2"/>
       </w:pPr>
+      <w:r>
+        <w:rPr>
+          <w:rStyle w:val="SectionNumber"/>
+        </w:rPr>
+        <w:t xml:space="preserve">9.5</w:t>
+      </w:r>
+      <w:r>
+        <w:tab/>
+      </w:r>
       <w:r>
         <w:t xml:space="preserve">9.5 Stage 03b — Short-read polish (Polypolish) / Illumina-only passthrough</w:t>
       </w:r>
@@ -11791,6 +11986,15 @@
         <w:pStyle w:val="Heading2"/>
       </w:pPr>
       <w:r>
+        <w:rPr>
+          <w:rStyle w:val="SectionNumber"/>
+        </w:rPr>
+        <w:t xml:space="preserve">9.6</w:t>
+      </w:r>
+      <w:r>
+        <w:tab/>
+      </w:r>
+      <w:r>
         <w:t xml:space="preserve">9.6 Stage 04 — Decontamination + organelle split</w:t>
       </w:r>
     </w:p>
@@ -12005,6 +12209,15 @@
         <w:pStyle w:val="Heading2"/>
       </w:pPr>
       <w:r>
+        <w:rPr>
+          <w:rStyle w:val="SectionNumber"/>
+        </w:rPr>
+        <w:t xml:space="preserve">9.7</w:t>
+      </w:r>
+      <w:r>
+        <w:tab/>
+      </w:r>
+      <w:r>
         <w:t xml:space="preserve">9.7 Stage 05 — Assembly QC + completeness</w:t>
       </w:r>
     </w:p>
@@ -12165,6 +12378,15 @@
         <w:pStyle w:val="Heading2"/>
       </w:pPr>
       <w:r>
+        <w:rPr>
+          <w:rStyle w:val="SectionNumber"/>
+        </w:rPr>
+        <w:t xml:space="preserve">9.8</w:t>
+      </w:r>
+      <w:r>
+        <w:tab/>
+      </w:r>
+      <w:r>
         <w:t xml:space="preserve">9.8 Stage 06 — Repeat modelling + soft-masking</w:t>
       </w:r>
     </w:p>
@@ -12282,6 +12504,15 @@
         <w:pStyle w:val="Heading2"/>
       </w:pPr>
       <w:r>
+        <w:rPr>
+          <w:rStyle w:val="SectionNumber"/>
+        </w:rPr>
+        <w:t xml:space="preserve">9.9</w:t>
+      </w:r>
+      <w:r>
+        <w:tab/>
+      </w:r>
+      <w:r>
         <w:t xml:space="preserve">9.9 Stage 07 — Eukaryotic annotation (Funannotate)</w:t>
       </w:r>
     </w:p>
@@ -12462,6 +12693,15 @@
         <w:pStyle w:val="Heading2"/>
       </w:pPr>
       <w:r>
+        <w:rPr>
+          <w:rStyle w:val="SectionNumber"/>
+        </w:rPr>
+        <w:t xml:space="preserve">9.10</w:t>
+      </w:r>
+      <w:r>
+        <w:tab/>
+      </w:r>
+      <w:r>
         <w:t xml:space="preserve">9.10 Stage 08 — Identification (GCPSR)</w:t>
       </w:r>
     </w:p>
@@ -12679,6 +12919,15 @@
         <w:pStyle w:val="Heading2"/>
       </w:pPr>
       <w:r>
+        <w:rPr>
+          <w:rStyle w:val="SectionNumber"/>
+        </w:rPr>
+        <w:t xml:space="preserve">9.11</w:t>
+      </w:r>
+      <w:r>
+        <w:tab/>
+      </w:r>
+      <w:r>
         <w:t xml:space="preserve">9.11 Stage 09 — Antifungal resistance (the centerpiece)</w:t>
       </w:r>
     </w:p>
@@ -12782,6 +13031,15 @@
         <w:pStyle w:val="Heading2"/>
       </w:pPr>
       <w:r>
+        <w:rPr>
+          <w:rStyle w:val="SectionNumber"/>
+        </w:rPr>
+        <w:t xml:space="preserve">9.12</w:t>
+      </w:r>
+      <w:r>
+        <w:tab/>
+      </w:r>
+      <w:r>
         <w:t xml:space="preserve">9.12 Stage 10 — Mobile &amp; repeat elements</w:t>
       </w:r>
     </w:p>
@@ -12898,6 +13156,15 @@
         <w:pStyle w:val="Heading2"/>
       </w:pPr>
       <w:r>
+        <w:rPr>
+          <w:rStyle w:val="SectionNumber"/>
+        </w:rPr>
+        <w:t xml:space="preserve">9.13</w:t>
+      </w:r>
+      <w:r>
+        <w:tab/>
+      </w:r>
+      <w:r>
         <w:t xml:space="preserve">9.13 Stage 11 — Biosynthetic gene clusters</w:t>
       </w:r>
     </w:p>
@@ -12986,6 +13253,15 @@
         <w:pStyle w:val="Heading2"/>
       </w:pPr>
       <w:r>
+        <w:rPr>
+          <w:rStyle w:val="SectionNumber"/>
+        </w:rPr>
+        <w:t xml:space="preserve">9.14</w:t>
+      </w:r>
+      <w:r>
+        <w:tab/>
+      </w:r>
+      <w:r>
         <w:t xml:space="preserve">9.14 Stage 12 — Novelty</w:t>
       </w:r>
     </w:p>
@@ -13099,6 +13375,15 @@
         <w:pStyle w:val="Heading2"/>
       </w:pPr>
       <w:r>
+        <w:rPr>
+          <w:rStyle w:val="SectionNumber"/>
+        </w:rPr>
+        <w:t xml:space="preserve">9.15</w:t>
+      </w:r>
+      <w:r>
+        <w:tab/>
+      </w:r>
+      <w:r>
         <w:t xml:space="preserve">9.15 Stage 13 — Eukaryote extras</w:t>
       </w:r>
     </w:p>
@@ -13183,6 +13468,15 @@
       <w:pPr>
         <w:pStyle w:val="Heading2"/>
       </w:pPr>
+      <w:r>
+        <w:rPr>
+          <w:rStyle w:val="SectionNumber"/>
+        </w:rPr>
+        <w:t xml:space="preserve">9.16</w:t>
+      </w:r>
+      <w:r>
+        <w:tab/>
+      </w:r>
       <w:r>
         <w:t xml:space="preserve">9.16 Stage 14 — Report + master table</w:t>
       </w:r>
@@ -13335,6 +13629,15 @@
       <w:pPr>
         <w:pStyle w:val="Heading1"/>
       </w:pPr>
+      <w:r>
+        <w:rPr>
+          <w:rStyle w:val="SectionNumber"/>
+        </w:rPr>
+        <w:t xml:space="preserve">10</w:t>
+      </w:r>
+      <w:r>
+        <w:tab/>
+      </w:r>
       <w:r>
         <w:t xml:space="preserve">10. The antifungal-resistance module in depth</w:t>
       </w:r>
@@ -14589,6 +14892,15 @@
         <w:pStyle w:val="Heading1"/>
       </w:pPr>
       <w:r>
+        <w:rPr>
+          <w:rStyle w:val="SectionNumber"/>
+        </w:rPr>
+        <w:t xml:space="preserve">11</w:t>
+      </w:r>
+      <w:r>
+        <w:tab/>
+      </w:r>
+      <w:r>
         <w:t xml:space="preserve">11. Outputs</w:t>
       </w:r>
     </w:p>
@@ -14597,6 +14909,15 @@
       <w:pPr>
         <w:pStyle w:val="Heading2"/>
       </w:pPr>
+      <w:r>
+        <w:rPr>
+          <w:rStyle w:val="SectionNumber"/>
+        </w:rPr>
+        <w:t xml:space="preserve">11.1</w:t>
+      </w:r>
+      <w:r>
+        <w:tab/>
+      </w:r>
       <w:r>
         <w:t xml:space="preserve">11.1 Per-isolate outputs</w:t>
       </w:r>
@@ -15244,6 +15565,15 @@
         <w:pStyle w:val="Heading2"/>
       </w:pPr>
       <w:r>
+        <w:rPr>
+          <w:rStyle w:val="SectionNumber"/>
+        </w:rPr>
+        <w:t xml:space="preserve">11.2</w:t>
+      </w:r>
+      <w:r>
+        <w:tab/>
+      </w:r>
+      <w:r>
         <w:t xml:space="preserve">11.2 The master table schema (the Layer-2 contract)</w:t>
       </w:r>
     </w:p>
@@ -15409,6 +15739,15 @@
       <w:pPr>
         <w:pStyle w:val="Heading2"/>
       </w:pPr>
+      <w:r>
+        <w:rPr>
+          <w:rStyle w:val="SectionNumber"/>
+        </w:rPr>
+        <w:t xml:space="preserve">11.3</w:t>
+      </w:r>
+      <w:r>
+        <w:tab/>
+      </w:r>
       <w:r>
         <w:t xml:space="preserve">11.3 Provenance</w:t>
       </w:r>
@@ -15479,6 +15818,15 @@
       <w:pPr>
         <w:pStyle w:val="Heading1"/>
       </w:pPr>
+      <w:r>
+        <w:rPr>
+          <w:rStyle w:val="SectionNumber"/>
+        </w:rPr>
+        <w:t xml:space="preserve">12</w:t>
+      </w:r>
+      <w:r>
+        <w:tab/>
+      </w:r>
       <w:r>
         <w:t xml:space="preserve">12. Layer 2 — the One Health comparative analysis</w:t>
       </w:r>
@@ -16064,6 +16412,15 @@
         <w:pStyle w:val="Heading1"/>
       </w:pPr>
       <w:r>
+        <w:rPr>
+          <w:rStyle w:val="SectionNumber"/>
+        </w:rPr>
+        <w:t xml:space="preserve">13</w:t>
+      </w:r>
+      <w:r>
+        <w:tab/>
+      </w:r>
+      <w:r>
         <w:t xml:space="preserve">13. Interpreting results</w:t>
       </w:r>
     </w:p>
@@ -16392,6 +16749,15 @@
       <w:pPr>
         <w:pStyle w:val="Heading1"/>
       </w:pPr>
+      <w:r>
+        <w:rPr>
+          <w:rStyle w:val="SectionNumber"/>
+        </w:rPr>
+        <w:t xml:space="preserve">14</w:t>
+      </w:r>
+      <w:r>
+        <w:tab/>
+      </w:r>
       <w:r>
         <w:t xml:space="preserve">14. Troubleshooting</w:t>
       </w:r>
@@ -16622,18 +16988,18 @@
               <w:pStyle w:val="Compact"/>
             </w:pPr>
             <w:r>
-              <w:t xml:space="preserve">Stage 07/11 take many hours on a Mac</w:t>
-            </w:r>
-          </w:p>
-        </w:tc>
-        <w:tc>
-          <w:tcPr/>
-          <w:p>
-            <w:pPr>
-              <w:pStyle w:val="Compact"/>
-            </w:pPr>
-            <w:r>
-              <w:t xml:space="preserve">linux/amd64 emulation — run on HPC, or accept the wall time; keep</w:t>
+              <w:t xml:space="preserve">Stage 07/11 take many hours locally</w:t>
+            </w:r>
+          </w:p>
+        </w:tc>
+        <w:tc>
+          <w:tcPr/>
+          <w:p>
+            <w:pPr>
+              <w:pStyle w:val="Compact"/>
+            </w:pPr>
+            <w:r>
+              <w:t xml:space="preserve">linux/amd64 emulation on arm64 hosts — run on a cluster, or accept the wall time; keep</w:t>
             </w:r>
             <w:r>
               <w:t xml:space="preserve"> </w:t>
@@ -16648,7 +17014,7 @@
               <w:t xml:space="preserve"> </w:t>
             </w:r>
             <w:r>
-              <w:t xml:space="preserve">on the Mac</w:t>
+              <w:t xml:space="preserve">locally</w:t>
             </w:r>
           </w:p>
         </w:tc>
@@ -17135,6 +17501,15 @@
         <w:pStyle w:val="Heading1"/>
       </w:pPr>
       <w:r>
+        <w:rPr>
+          <w:rStyle w:val="SectionNumber"/>
+        </w:rPr>
+        <w:t xml:space="preserve">15</w:t>
+      </w:r>
+      <w:r>
+        <w:tab/>
+      </w:r>
+      <w:r>
         <w:t xml:space="preserve">15. Reproducibility &amp; provenance</w:t>
       </w:r>
     </w:p>
@@ -17278,6 +17653,15 @@
       <w:pPr>
         <w:pStyle w:val="Heading1"/>
       </w:pPr>
+      <w:r>
+        <w:rPr>
+          <w:rStyle w:val="SectionNumber"/>
+        </w:rPr>
+        <w:t xml:space="preserve">16</w:t>
+      </w:r>
+      <w:r>
+        <w:tab/>
+      </w:r>
       <w:r>
         <w:t xml:space="preserve">16. Extending FungiForge</w:t>
       </w:r>
@@ -17440,6 +17824,15 @@
         <w:pStyle w:val="Heading1"/>
       </w:pPr>
       <w:r>
+        <w:rPr>
+          <w:rStyle w:val="SectionNumber"/>
+        </w:rPr>
+        <w:t xml:space="preserve">17</w:t>
+      </w:r>
+      <w:r>
+        <w:tab/>
+      </w:r>
+      <w:r>
         <w:t xml:space="preserve">17. Glossary</w:t>
       </w:r>
     </w:p>
@@ -17751,6 +18144,15 @@
       <w:pPr>
         <w:pStyle w:val="Heading1"/>
       </w:pPr>
+      <w:r>
+        <w:rPr>
+          <w:rStyle w:val="SectionNumber"/>
+        </w:rPr>
+        <w:t xml:space="preserve">18</w:t>
+      </w:r>
+      <w:r>
+        <w:tab/>
+      </w:r>
       <w:r>
         <w:t xml:space="preserve">18. Citation</w:t>
       </w:r>

</xml_diff>

<commit_message>
assembly: --min_contig_len (500) — filter short-read contigs before QC/annotation
First real Illumina-only run (SPAdes, 3,686 contigs) failed at annotation: funannotate
refuses an assembly with contigs whose alphabet has <4 bases (three homopolymer stubs
of 78-155 bp). Short-read assemblers routinely leave thousands of tiny fragments; the
pipeline had no length filter anywhere.

- SR_ASSEMBLE: keep contigs >= params.min_contig_len with >= 4 distinct bases (awk, no
  new dependency); logs kept/total.
- ANNOTATE: `funannotate sort --minlen` with the same value, so every path is covered.
- nextflow.config: min_contig_len = 500 (the conventional short-read reporting threshold).
Verified: synthetic case keeps only the valid contig; the CEA10 long-read assembly passes
unchanged (43/43 contigs, identical base count); stub DAG intact. Docs + manual updated.
</commit_message>
<xml_diff>
--- a/docs/manual/fungiforge_manual.docx
+++ b/docs/manual/fungiforge_manual.docx
@@ -9621,6 +9621,56 @@
             </w:pPr>
             <w:r>
               <w:t xml:space="preserve">collapse heterozygous haplotigs after long-read assembly (skipped for short-read)</w:t>
+            </w:r>
+          </w:p>
+        </w:tc>
+      </w:tr>
+      <w:tr>
+        <w:tc>
+          <w:tcPr/>
+          <w:p>
+            <w:pPr>
+              <w:pStyle w:val="Compact"/>
+            </w:pPr>
+            <w:r>
+              <w:rPr>
+                <w:rStyle w:val="VerbatimChar"/>
+              </w:rPr>
+              <w:t xml:space="preserve">--min_contig_len</w:t>
+            </w:r>
+          </w:p>
+        </w:tc>
+        <w:tc>
+          <w:tcPr/>
+          <w:p>
+            <w:pPr>
+              <w:pStyle w:val="Compact"/>
+            </w:pPr>
+            <w:r>
+              <w:rPr>
+                <w:rStyle w:val="VerbatimChar"/>
+              </w:rPr>
+              <w:t xml:space="preserve">500</w:t>
+            </w:r>
+          </w:p>
+        </w:tc>
+        <w:tc>
+          <w:tcPr/>
+          <w:p>
+            <w:pPr>
+              <w:pStyle w:val="Compact"/>
+            </w:pPr>
+            <w:r>
+              <w:t xml:space="preserve">drop contigs shorter than this, or with fewer than 4 distinct bases, at short-read assembly and before annotation (</w:t>
+            </w:r>
+            <w:r>
+              <w:rPr>
+                <w:rStyle w:val="VerbatimChar"/>
+              </w:rPr>
+              <w:t xml:space="preserve">funannotate sort --minlen</w:t>
+            </w:r>
+            <w:r>
+              <w:t xml:space="preserve">); short-read assemblers leave many tiny fragments and occasional homopolymer stubs that funannotate rejects</w:t>
             </w:r>
           </w:p>
         </w:tc>

</xml_diff>